<commit_message>
only missing cpu_top.sv module
</commit_message>
<xml_diff>
--- a/design_log.docx
+++ b/design_log.docx
@@ -70,10 +70,10 @@
     <w:p>
       <w:r>
         <w:drawing>
-          <wp:inline distT="0" distB="0" distL="0" distR="0" wp14:anchorId="1D3491F3" wp14:editId="04CFD70C">
-            <wp:extent cx="5493032" cy="2482978"/>
-            <wp:effectExtent l="0" t="0" r="0" b="0"/>
-            <wp:docPr id="1421938365" name="Picture 1"/>
+          <wp:inline distT="0" distB="0" distL="0" distR="0" wp14:anchorId="3ECB5747" wp14:editId="2526A12F">
+            <wp:extent cx="5731510" cy="1374140"/>
+            <wp:effectExtent l="0" t="0" r="2540" b="0"/>
+            <wp:docPr id="2029826691" name="Picture 1"/>
             <wp:cNvGraphicFramePr>
               <a:graphicFrameLocks xmlns:a="http://schemas.openxmlformats.org/drawingml/2006/main" noChangeAspect="1"/>
             </wp:cNvGraphicFramePr>
@@ -81,7 +81,7 @@
               <a:graphicData uri="http://schemas.openxmlformats.org/drawingml/2006/picture">
                 <pic:pic xmlns:pic="http://schemas.openxmlformats.org/drawingml/2006/picture">
                   <pic:nvPicPr>
-                    <pic:cNvPr id="1421938365" name=""/>
+                    <pic:cNvPr id="2029826691" name=""/>
                     <pic:cNvPicPr/>
                   </pic:nvPicPr>
                   <pic:blipFill>
@@ -93,7 +93,7 @@
                   <pic:spPr>
                     <a:xfrm>
                       <a:off x="0" y="0"/>
-                      <a:ext cx="5493032" cy="2482978"/>
+                      <a:ext cx="5731510" cy="1374140"/>
                     </a:xfrm>
                     <a:prstGeom prst="rect">
                       <a:avLst/>
@@ -114,7 +114,6 @@
     </w:p>
     <w:p>
       <w:r>
-        <w:lastRenderedPageBreak/>
         <w:drawing>
           <wp:inline distT="0" distB="0" distL="0" distR="0" wp14:anchorId="4B3928C4" wp14:editId="6ADDB354">
             <wp:extent cx="4330923" cy="3626036"/>
@@ -155,6 +154,7 @@
     <w:p/>
     <w:p>
       <w:r>
+        <w:lastRenderedPageBreak/>
         <w:t>Bram.sv</w:t>
       </w:r>
     </w:p>
@@ -171,10 +171,10 @@
           <w:bCs/>
         </w:rPr>
         <w:drawing>
-          <wp:inline distT="0" distB="0" distL="0" distR="0" wp14:anchorId="6F92AA93" wp14:editId="0CEDF76C">
-            <wp:extent cx="5731510" cy="1890395"/>
-            <wp:effectExtent l="0" t="0" r="2540" b="0"/>
-            <wp:docPr id="300826920" name="Picture 1"/>
+          <wp:inline distT="0" distB="0" distL="0" distR="0" wp14:anchorId="57DE6F66" wp14:editId="0B647B97">
+            <wp:extent cx="5512083" cy="2025754"/>
+            <wp:effectExtent l="0" t="0" r="0" b="0"/>
+            <wp:docPr id="2071911303" name="Picture 1"/>
             <wp:cNvGraphicFramePr>
               <a:graphicFrameLocks xmlns:a="http://schemas.openxmlformats.org/drawingml/2006/main" noChangeAspect="1"/>
             </wp:cNvGraphicFramePr>
@@ -182,7 +182,7 @@
               <a:graphicData uri="http://schemas.openxmlformats.org/drawingml/2006/picture">
                 <pic:pic xmlns:pic="http://schemas.openxmlformats.org/drawingml/2006/picture">
                   <pic:nvPicPr>
-                    <pic:cNvPr id="300826920" name=""/>
+                    <pic:cNvPr id="2071911303" name=""/>
                     <pic:cNvPicPr/>
                   </pic:nvPicPr>
                   <pic:blipFill>
@@ -194,7 +194,7 @@
                   <pic:spPr>
                     <a:xfrm>
                       <a:off x="0" y="0"/>
-                      <a:ext cx="5731510" cy="1890395"/>
+                      <a:ext cx="5512083" cy="2025754"/>
                     </a:xfrm>
                     <a:prstGeom prst="rect">
                       <a:avLst/>
@@ -216,46 +216,6 @@
       </w:pPr>
     </w:p>
     <w:p>
-      <w:pPr>
-        <w:rPr>
-          <w:b/>
-          <w:bCs/>
-        </w:rPr>
-      </w:pPr>
-    </w:p>
-    <w:p>
-      <w:pPr>
-        <w:rPr>
-          <w:b/>
-          <w:bCs/>
-        </w:rPr>
-      </w:pPr>
-    </w:p>
-    <w:p>
-      <w:pPr>
-        <w:rPr>
-          <w:b/>
-          <w:bCs/>
-        </w:rPr>
-      </w:pPr>
-    </w:p>
-    <w:p>
-      <w:pPr>
-        <w:rPr>
-          <w:b/>
-          <w:bCs/>
-        </w:rPr>
-      </w:pPr>
-    </w:p>
-    <w:p>
-      <w:pPr>
-        <w:rPr>
-          <w:b/>
-          <w:bCs/>
-        </w:rPr>
-      </w:pPr>
-    </w:p>
-    <w:p>
       <w:r>
         <w:t>Bram_formatting.sv</w:t>
       </w:r>
@@ -272,11 +232,10 @@
           <w:b/>
           <w:bCs/>
         </w:rPr>
-        <w:lastRenderedPageBreak/>
         <w:drawing>
-          <wp:inline distT="0" distB="0" distL="0" distR="0" wp14:anchorId="2257CD87" wp14:editId="1D747B01">
-            <wp:extent cx="3721291" cy="1720938"/>
-            <wp:effectExtent l="0" t="0" r="0" b="0"/>
+          <wp:inline distT="0" distB="0" distL="0" distR="0" wp14:anchorId="2257CD87" wp14:editId="65002137">
+            <wp:extent cx="3232150" cy="1494731"/>
+            <wp:effectExtent l="0" t="0" r="6350" b="0"/>
             <wp:docPr id="984595616" name="Picture 1"/>
             <wp:cNvGraphicFramePr>
               <a:graphicFrameLocks xmlns:a="http://schemas.openxmlformats.org/drawingml/2006/main" noChangeAspect="1"/>
@@ -297,7 +256,248 @@
                   <pic:spPr>
                     <a:xfrm>
                       <a:off x="0" y="0"/>
-                      <a:ext cx="3721291" cy="1720938"/>
+                      <a:ext cx="3238155" cy="1497508"/>
+                    </a:xfrm>
+                    <a:prstGeom prst="rect">
+                      <a:avLst/>
+                    </a:prstGeom>
+                  </pic:spPr>
+                </pic:pic>
+              </a:graphicData>
+            </a:graphic>
+          </wp:inline>
+        </w:drawing>
+      </w:r>
+    </w:p>
+    <w:p>
+      <w:pPr>
+        <w:rPr>
+          <w:b/>
+          <w:bCs/>
+        </w:rPr>
+      </w:pPr>
+    </w:p>
+    <w:p>
+      <w:pPr>
+        <w:rPr>
+          <w:b/>
+          <w:bCs/>
+        </w:rPr>
+      </w:pPr>
+      <w:r>
+        <w:rPr>
+          <w:b/>
+          <w:bCs/>
+        </w:rPr>
+        <w:t>Register_formatting.sv</w:t>
+      </w:r>
+    </w:p>
+    <w:p>
+      <w:pPr>
+        <w:rPr>
+          <w:b/>
+          <w:bCs/>
+        </w:rPr>
+      </w:pPr>
+      <w:r>
+        <w:rPr>
+          <w:b/>
+          <w:bCs/>
+        </w:rPr>
+        <w:drawing>
+          <wp:inline distT="0" distB="0" distL="0" distR="0" wp14:anchorId="0104AA1A" wp14:editId="3E07099D">
+            <wp:extent cx="2959100" cy="1597799"/>
+            <wp:effectExtent l="0" t="0" r="0" b="2540"/>
+            <wp:docPr id="971636341" name="Picture 1"/>
+            <wp:cNvGraphicFramePr>
+              <a:graphicFrameLocks xmlns:a="http://schemas.openxmlformats.org/drawingml/2006/main" noChangeAspect="1"/>
+            </wp:cNvGraphicFramePr>
+            <a:graphic xmlns:a="http://schemas.openxmlformats.org/drawingml/2006/main">
+              <a:graphicData uri="http://schemas.openxmlformats.org/drawingml/2006/picture">
+                <pic:pic xmlns:pic="http://schemas.openxmlformats.org/drawingml/2006/picture">
+                  <pic:nvPicPr>
+                    <pic:cNvPr id="971636341" name=""/>
+                    <pic:cNvPicPr/>
+                  </pic:nvPicPr>
+                  <pic:blipFill>
+                    <a:blip r:embed="rId9"/>
+                    <a:stretch>
+                      <a:fillRect/>
+                    </a:stretch>
+                  </pic:blipFill>
+                  <pic:spPr>
+                    <a:xfrm>
+                      <a:off x="0" y="0"/>
+                      <a:ext cx="2975829" cy="1606832"/>
+                    </a:xfrm>
+                    <a:prstGeom prst="rect">
+                      <a:avLst/>
+                    </a:prstGeom>
+                  </pic:spPr>
+                </pic:pic>
+              </a:graphicData>
+            </a:graphic>
+          </wp:inline>
+        </w:drawing>
+      </w:r>
+    </w:p>
+    <w:p>
+      <w:pPr>
+        <w:rPr>
+          <w:b/>
+          <w:bCs/>
+        </w:rPr>
+      </w:pPr>
+    </w:p>
+    <w:p>
+      <w:pPr>
+        <w:rPr>
+          <w:b/>
+          <w:bCs/>
+        </w:rPr>
+      </w:pPr>
+    </w:p>
+    <w:p>
+      <w:pPr>
+        <w:rPr>
+          <w:b/>
+          <w:bCs/>
+        </w:rPr>
+      </w:pPr>
+    </w:p>
+    <w:p>
+      <w:pPr>
+        <w:rPr>
+          <w:b/>
+          <w:bCs/>
+        </w:rPr>
+      </w:pPr>
+    </w:p>
+    <w:p>
+      <w:pPr>
+        <w:rPr>
+          <w:b/>
+          <w:bCs/>
+        </w:rPr>
+      </w:pPr>
+      <w:r>
+        <w:rPr>
+          <w:b/>
+          <w:bCs/>
+        </w:rPr>
+        <w:lastRenderedPageBreak/>
+        <w:t>Imm_formatting.sv</w:t>
+      </w:r>
+    </w:p>
+    <w:p>
+      <w:pPr>
+        <w:rPr>
+          <w:b/>
+          <w:bCs/>
+        </w:rPr>
+      </w:pPr>
+      <w:r>
+        <w:rPr>
+          <w:b/>
+          <w:bCs/>
+        </w:rPr>
+        <w:drawing>
+          <wp:inline distT="0" distB="0" distL="0" distR="0" wp14:anchorId="24B4B4AA" wp14:editId="43839F2C">
+            <wp:extent cx="4750044" cy="1530429"/>
+            <wp:effectExtent l="0" t="0" r="0" b="0"/>
+            <wp:docPr id="1723121445" name="Picture 1"/>
+            <wp:cNvGraphicFramePr>
+              <a:graphicFrameLocks xmlns:a="http://schemas.openxmlformats.org/drawingml/2006/main" noChangeAspect="1"/>
+            </wp:cNvGraphicFramePr>
+            <a:graphic xmlns:a="http://schemas.openxmlformats.org/drawingml/2006/main">
+              <a:graphicData uri="http://schemas.openxmlformats.org/drawingml/2006/picture">
+                <pic:pic xmlns:pic="http://schemas.openxmlformats.org/drawingml/2006/picture">
+                  <pic:nvPicPr>
+                    <pic:cNvPr id="1723121445" name=""/>
+                    <pic:cNvPicPr/>
+                  </pic:nvPicPr>
+                  <pic:blipFill>
+                    <a:blip r:embed="rId10"/>
+                    <a:stretch>
+                      <a:fillRect/>
+                    </a:stretch>
+                  </pic:blipFill>
+                  <pic:spPr>
+                    <a:xfrm>
+                      <a:off x="0" y="0"/>
+                      <a:ext cx="4750044" cy="1530429"/>
+                    </a:xfrm>
+                    <a:prstGeom prst="rect">
+                      <a:avLst/>
+                    </a:prstGeom>
+                  </pic:spPr>
+                </pic:pic>
+              </a:graphicData>
+            </a:graphic>
+          </wp:inline>
+        </w:drawing>
+      </w:r>
+    </w:p>
+    <w:p>
+      <w:pPr>
+        <w:rPr>
+          <w:b/>
+          <w:bCs/>
+        </w:rPr>
+      </w:pPr>
+    </w:p>
+    <w:p>
+      <w:pPr>
+        <w:rPr>
+          <w:b/>
+          <w:bCs/>
+        </w:rPr>
+      </w:pPr>
+      <w:r>
+        <w:rPr>
+          <w:b/>
+          <w:bCs/>
+        </w:rPr>
+        <w:t>Alu.sv</w:t>
+      </w:r>
+    </w:p>
+    <w:p>
+      <w:pPr>
+        <w:rPr>
+          <w:b/>
+          <w:bCs/>
+        </w:rPr>
+      </w:pPr>
+      <w:r>
+        <w:rPr>
+          <w:b/>
+          <w:bCs/>
+        </w:rPr>
+        <w:drawing>
+          <wp:inline distT="0" distB="0" distL="0" distR="0" wp14:anchorId="28F51614" wp14:editId="5D5CBA55">
+            <wp:extent cx="4769095" cy="4521432"/>
+            <wp:effectExtent l="0" t="0" r="0" b="0"/>
+            <wp:docPr id="1836458894" name="Picture 1"/>
+            <wp:cNvGraphicFramePr>
+              <a:graphicFrameLocks xmlns:a="http://schemas.openxmlformats.org/drawingml/2006/main" noChangeAspect="1"/>
+            </wp:cNvGraphicFramePr>
+            <a:graphic xmlns:a="http://schemas.openxmlformats.org/drawingml/2006/main">
+              <a:graphicData uri="http://schemas.openxmlformats.org/drawingml/2006/picture">
+                <pic:pic xmlns:pic="http://schemas.openxmlformats.org/drawingml/2006/picture">
+                  <pic:nvPicPr>
+                    <pic:cNvPr id="1836458894" name=""/>
+                    <pic:cNvPicPr/>
+                  </pic:nvPicPr>
+                  <pic:blipFill>
+                    <a:blip r:embed="rId11"/>
+                    <a:stretch>
+                      <a:fillRect/>
+                    </a:stretch>
+                  </pic:blipFill>
+                  <pic:spPr>
+                    <a:xfrm>
+                      <a:off x="0" y="0"/>
+                      <a:ext cx="4769095" cy="4521432"/>
                     </a:xfrm>
                     <a:prstGeom prst="rect">
                       <a:avLst/>

</xml_diff>

<commit_message>
working version 1: before cleanup
</commit_message>
<xml_diff>
--- a/design_log.docx
+++ b/design_log.docx
@@ -4,9 +4,237 @@
   <w:body>
     <w:p>
       <w:r>
+        <w:drawing>
+          <wp:inline distT="0" distB="0" distL="0" distR="0" wp14:anchorId="7B975BFA" wp14:editId="2A9FA77B">
+            <wp:extent cx="4409086" cy="3249508"/>
+            <wp:effectExtent l="8255" t="0" r="0" b="0"/>
+            <wp:docPr id="1885888045" name="Picture 2"/>
+            <wp:cNvGraphicFramePr>
+              <a:graphicFrameLocks xmlns:a="http://schemas.openxmlformats.org/drawingml/2006/main" noChangeAspect="1"/>
+            </wp:cNvGraphicFramePr>
+            <a:graphic xmlns:a="http://schemas.openxmlformats.org/drawingml/2006/main">
+              <a:graphicData uri="http://schemas.openxmlformats.org/drawingml/2006/picture">
+                <pic:pic xmlns:pic="http://schemas.openxmlformats.org/drawingml/2006/picture">
+                  <pic:nvPicPr>
+                    <pic:cNvPr id="0" name="Picture 6"/>
+                    <pic:cNvPicPr>
+                      <a:picLocks noChangeAspect="1" noChangeArrowheads="1"/>
+                    </pic:cNvPicPr>
+                  </pic:nvPicPr>
+                  <pic:blipFill rotWithShape="1">
+                    <a:blip r:embed="rId4" cstate="print">
+                      <a:extLst>
+                        <a:ext uri="{28A0092B-C50C-407E-A947-70E740481C1C}">
+                          <a14:useLocalDpi xmlns:a14="http://schemas.microsoft.com/office/drawing/2010/main" val="0"/>
+                        </a:ext>
+                      </a:extLst>
+                    </a:blip>
+                    <a:srcRect l="4785" t="6441"/>
+                    <a:stretch>
+                      <a:fillRect/>
+                    </a:stretch>
+                  </pic:blipFill>
+                  <pic:spPr bwMode="auto">
+                    <a:xfrm rot="5400000">
+                      <a:off x="0" y="0"/>
+                      <a:ext cx="4416261" cy="3254796"/>
+                    </a:xfrm>
+                    <a:prstGeom prst="rect">
+                      <a:avLst/>
+                    </a:prstGeom>
+                    <a:noFill/>
+                    <a:ln>
+                      <a:noFill/>
+                    </a:ln>
+                    <a:extLst>
+                      <a:ext uri="{53640926-AAD7-44D8-BBD7-CCE9431645EC}">
+                        <a14:shadowObscured xmlns:a14="http://schemas.microsoft.com/office/drawing/2010/main"/>
+                      </a:ext>
+                    </a:extLst>
+                  </pic:spPr>
+                </pic:pic>
+              </a:graphicData>
+            </a:graphic>
+          </wp:inline>
+        </w:drawing>
+      </w:r>
+    </w:p>
+    <w:p>
+      <w:r>
+        <w:drawing>
+          <wp:inline distT="0" distB="0" distL="0" distR="0" wp14:anchorId="3AC8E3CB" wp14:editId="664971CD">
+            <wp:extent cx="4135938" cy="3289330"/>
+            <wp:effectExtent l="4128" t="0" r="2222" b="2223"/>
+            <wp:docPr id="1527332735" name="Picture 4"/>
+            <wp:cNvGraphicFramePr>
+              <a:graphicFrameLocks xmlns:a="http://schemas.openxmlformats.org/drawingml/2006/main" noChangeAspect="1"/>
+            </wp:cNvGraphicFramePr>
+            <a:graphic xmlns:a="http://schemas.openxmlformats.org/drawingml/2006/main">
+              <a:graphicData uri="http://schemas.openxmlformats.org/drawingml/2006/picture">
+                <pic:pic xmlns:pic="http://schemas.openxmlformats.org/drawingml/2006/picture">
+                  <pic:nvPicPr>
+                    <pic:cNvPr id="0" name="Picture 13"/>
+                    <pic:cNvPicPr>
+                      <a:picLocks noChangeAspect="1" noChangeArrowheads="1"/>
+                    </pic:cNvPicPr>
+                  </pic:nvPicPr>
+                  <pic:blipFill rotWithShape="1">
+                    <a:blip r:embed="rId5" cstate="print">
+                      <a:extLst>
+                        <a:ext uri="{28A0092B-C50C-407E-A947-70E740481C1C}">
+                          <a14:useLocalDpi xmlns:a14="http://schemas.microsoft.com/office/drawing/2010/main" val="0"/>
+                        </a:ext>
+                      </a:extLst>
+                    </a:blip>
+                    <a:srcRect l="3527" t="3875" r="9644" b="4057"/>
+                    <a:stretch>
+                      <a:fillRect/>
+                    </a:stretch>
+                  </pic:blipFill>
+                  <pic:spPr bwMode="auto">
+                    <a:xfrm rot="5400000">
+                      <a:off x="0" y="0"/>
+                      <a:ext cx="4151693" cy="3301860"/>
+                    </a:xfrm>
+                    <a:prstGeom prst="rect">
+                      <a:avLst/>
+                    </a:prstGeom>
+                    <a:noFill/>
+                    <a:ln>
+                      <a:noFill/>
+                    </a:ln>
+                    <a:extLst>
+                      <a:ext uri="{53640926-AAD7-44D8-BBD7-CCE9431645EC}">
+                        <a14:shadowObscured xmlns:a14="http://schemas.microsoft.com/office/drawing/2010/main"/>
+                      </a:ext>
+                    </a:extLst>
+                  </pic:spPr>
+                </pic:pic>
+              </a:graphicData>
+            </a:graphic>
+          </wp:inline>
+        </w:drawing>
+      </w:r>
+    </w:p>
+    <w:p/>
+    <w:p>
+      <w:pPr>
         <w:rPr>
           <w:rFonts w:hint="eastAsia"/>
         </w:rPr>
+      </w:pPr>
+      <w:r>
+        <w:drawing>
+          <wp:inline distT="0" distB="0" distL="0" distR="0" wp14:anchorId="2C0E89A1" wp14:editId="1319F7F0">
+            <wp:extent cx="5731510" cy="4298950"/>
+            <wp:effectExtent l="0" t="0" r="2540" b="6350"/>
+            <wp:docPr id="463055639" name="Picture 6"/>
+            <wp:cNvGraphicFramePr>
+              <a:graphicFrameLocks xmlns:a="http://schemas.openxmlformats.org/drawingml/2006/main" noChangeAspect="1"/>
+            </wp:cNvGraphicFramePr>
+            <a:graphic xmlns:a="http://schemas.openxmlformats.org/drawingml/2006/main">
+              <a:graphicData uri="http://schemas.openxmlformats.org/drawingml/2006/picture">
+                <pic:pic xmlns:pic="http://schemas.openxmlformats.org/drawingml/2006/picture">
+                  <pic:nvPicPr>
+                    <pic:cNvPr id="0" name="Picture 20"/>
+                    <pic:cNvPicPr>
+                      <a:picLocks noChangeAspect="1" noChangeArrowheads="1"/>
+                    </pic:cNvPicPr>
+                  </pic:nvPicPr>
+                  <pic:blipFill>
+                    <a:blip r:embed="rId6" cstate="print">
+                      <a:extLst>
+                        <a:ext uri="{28A0092B-C50C-407E-A947-70E740481C1C}">
+                          <a14:useLocalDpi xmlns:a14="http://schemas.microsoft.com/office/drawing/2010/main" val="0"/>
+                        </a:ext>
+                      </a:extLst>
+                    </a:blip>
+                    <a:srcRect/>
+                    <a:stretch>
+                      <a:fillRect/>
+                    </a:stretch>
+                  </pic:blipFill>
+                  <pic:spPr bwMode="auto">
+                    <a:xfrm>
+                      <a:off x="0" y="0"/>
+                      <a:ext cx="5731510" cy="4298950"/>
+                    </a:xfrm>
+                    <a:prstGeom prst="rect">
+                      <a:avLst/>
+                    </a:prstGeom>
+                    <a:noFill/>
+                    <a:ln>
+                      <a:noFill/>
+                    </a:ln>
+                  </pic:spPr>
+                </pic:pic>
+              </a:graphicData>
+            </a:graphic>
+          </wp:inline>
+        </w:drawing>
+      </w:r>
+      <w:r>
+        <w:drawing>
+          <wp:inline distT="0" distB="0" distL="0" distR="0" wp14:anchorId="24B9402C" wp14:editId="2C0691F4">
+            <wp:extent cx="4136801" cy="4135352"/>
+            <wp:effectExtent l="0" t="0" r="0" b="0"/>
+            <wp:docPr id="1732418435" name="Picture 8"/>
+            <wp:cNvGraphicFramePr>
+              <a:graphicFrameLocks xmlns:a="http://schemas.openxmlformats.org/drawingml/2006/main" noChangeAspect="1"/>
+            </wp:cNvGraphicFramePr>
+            <a:graphic xmlns:a="http://schemas.openxmlformats.org/drawingml/2006/main">
+              <a:graphicData uri="http://schemas.openxmlformats.org/drawingml/2006/picture">
+                <pic:pic xmlns:pic="http://schemas.openxmlformats.org/drawingml/2006/picture">
+                  <pic:nvPicPr>
+                    <pic:cNvPr id="0" name="Picture 27"/>
+                    <pic:cNvPicPr>
+                      <a:picLocks noChangeAspect="1" noChangeArrowheads="1"/>
+                    </pic:cNvPicPr>
+                  </pic:nvPicPr>
+                  <pic:blipFill rotWithShape="1">
+                    <a:blip r:embed="rId7" cstate="print">
+                      <a:extLst>
+                        <a:ext uri="{28A0092B-C50C-407E-A947-70E740481C1C}">
+                          <a14:useLocalDpi xmlns:a14="http://schemas.microsoft.com/office/drawing/2010/main" val="0"/>
+                        </a:ext>
+                      </a:extLst>
+                    </a:blip>
+                    <a:srcRect l="12637" t="3791" r="15175"/>
+                    <a:stretch>
+                      <a:fillRect/>
+                    </a:stretch>
+                  </pic:blipFill>
+                  <pic:spPr bwMode="auto">
+                    <a:xfrm>
+                      <a:off x="0" y="0"/>
+                      <a:ext cx="4137412" cy="4135963"/>
+                    </a:xfrm>
+                    <a:prstGeom prst="rect">
+                      <a:avLst/>
+                    </a:prstGeom>
+                    <a:noFill/>
+                    <a:ln>
+                      <a:noFill/>
+                    </a:ln>
+                    <a:extLst>
+                      <a:ext uri="{53640926-AAD7-44D8-BBD7-CCE9431645EC}">
+                        <a14:shadowObscured xmlns:a14="http://schemas.microsoft.com/office/drawing/2010/main"/>
+                      </a:ext>
+                    </a:extLst>
+                  </pic:spPr>
+                </pic:pic>
+              </a:graphicData>
+            </a:graphic>
+          </wp:inline>
+        </w:drawing>
+      </w:r>
+    </w:p>
+    <w:p>
+      <w:r>
+        <w:rPr>
+          <w:rFonts w:hint="eastAsia"/>
+        </w:rPr>
+        <w:lastRenderedPageBreak/>
         <w:t>P</w:t>
       </w:r>
       <w:r>
@@ -18,6 +246,9 @@
     </w:p>
     <w:p>
       <w:r>
+        <w:rPr>
+          <w:noProof/>
+        </w:rPr>
         <w:drawing>
           <wp:inline distT="0" distB="0" distL="0" distR="0" wp14:anchorId="3D922280" wp14:editId="2A425980">
             <wp:extent cx="4692891" cy="1257365"/>
@@ -34,7 +265,7 @@
                     <pic:cNvPicPr/>
                   </pic:nvPicPr>
                   <pic:blipFill>
-                    <a:blip r:embed="rId4"/>
+                    <a:blip r:embed="rId8"/>
                     <a:stretch>
                       <a:fillRect/>
                     </a:stretch>
@@ -69,6 +300,9 @@
     </w:p>
     <w:p>
       <w:r>
+        <w:rPr>
+          <w:noProof/>
+        </w:rPr>
         <w:drawing>
           <wp:inline distT="0" distB="0" distL="0" distR="0" wp14:anchorId="3ECB5747" wp14:editId="2526A12F">
             <wp:extent cx="5731510" cy="1374140"/>
@@ -85,7 +319,7 @@
                     <pic:cNvPicPr/>
                   </pic:nvPicPr>
                   <pic:blipFill>
-                    <a:blip r:embed="rId5"/>
+                    <a:blip r:embed="rId9"/>
                     <a:stretch>
                       <a:fillRect/>
                     </a:stretch>
@@ -114,6 +348,9 @@
     </w:p>
     <w:p>
       <w:r>
+        <w:rPr>
+          <w:noProof/>
+        </w:rPr>
         <w:drawing>
           <wp:inline distT="0" distB="0" distL="0" distR="0" wp14:anchorId="4B3928C4" wp14:editId="6ADDB354">
             <wp:extent cx="4330923" cy="3626036"/>
@@ -130,7 +367,7 @@
                     <pic:cNvPicPr/>
                   </pic:nvPicPr>
                   <pic:blipFill>
-                    <a:blip r:embed="rId6"/>
+                    <a:blip r:embed="rId10"/>
                     <a:stretch>
                       <a:fillRect/>
                     </a:stretch>
@@ -169,6 +406,7 @@
         <w:rPr>
           <w:b/>
           <w:bCs/>
+          <w:noProof/>
         </w:rPr>
         <w:drawing>
           <wp:inline distT="0" distB="0" distL="0" distR="0" wp14:anchorId="57DE6F66" wp14:editId="0B647B97">
@@ -186,7 +424,7 @@
                     <pic:cNvPicPr/>
                   </pic:nvPicPr>
                   <pic:blipFill>
-                    <a:blip r:embed="rId7"/>
+                    <a:blip r:embed="rId11"/>
                     <a:stretch>
                       <a:fillRect/>
                     </a:stretch>
@@ -231,6 +469,7 @@
         <w:rPr>
           <w:b/>
           <w:bCs/>
+          <w:noProof/>
         </w:rPr>
         <w:drawing>
           <wp:inline distT="0" distB="0" distL="0" distR="0" wp14:anchorId="2257CD87" wp14:editId="65002137">
@@ -248,7 +487,7 @@
                     <pic:cNvPicPr/>
                   </pic:nvPicPr>
                   <pic:blipFill>
-                    <a:blip r:embed="rId8"/>
+                    <a:blip r:embed="rId12"/>
                     <a:stretch>
                       <a:fillRect/>
                     </a:stretch>
@@ -303,6 +542,7 @@
         <w:rPr>
           <w:b/>
           <w:bCs/>
+          <w:noProof/>
         </w:rPr>
         <w:drawing>
           <wp:inline distT="0" distB="0" distL="0" distR="0" wp14:anchorId="0104AA1A" wp14:editId="3E07099D">
@@ -320,7 +560,7 @@
                     <pic:cNvPicPr/>
                   </pic:nvPicPr>
                   <pic:blipFill>
-                    <a:blip r:embed="rId9"/>
+                    <a:blip r:embed="rId13"/>
                     <a:stretch>
                       <a:fillRect/>
                     </a:stretch>
@@ -400,6 +640,7 @@
         <w:rPr>
           <w:b/>
           <w:bCs/>
+          <w:noProof/>
         </w:rPr>
         <w:drawing>
           <wp:inline distT="0" distB="0" distL="0" distR="0" wp14:anchorId="24B4B4AA" wp14:editId="43839F2C">
@@ -417,7 +658,7 @@
                     <pic:cNvPicPr/>
                   </pic:nvPicPr>
                   <pic:blipFill>
-                    <a:blip r:embed="rId10"/>
+                    <a:blip r:embed="rId14"/>
                     <a:stretch>
                       <a:fillRect/>
                     </a:stretch>
@@ -472,6 +713,7 @@
         <w:rPr>
           <w:b/>
           <w:bCs/>
+          <w:noProof/>
         </w:rPr>
         <w:drawing>
           <wp:inline distT="0" distB="0" distL="0" distR="0" wp14:anchorId="28F51614" wp14:editId="5D5CBA55">
@@ -489,7 +731,7 @@
                     <pic:cNvPicPr/>
                   </pic:nvPicPr>
                   <pic:blipFill>
-                    <a:blip r:embed="rId11"/>
+                    <a:blip r:embed="rId15"/>
                     <a:stretch>
                       <a:fillRect/>
                     </a:stretch>
@@ -1127,7 +1369,6 @@
   <w:style w:type="character" w:default="1" w:styleId="DefaultParagraphFont">
     <w:name w:val="Default Paragraph Font"/>
     <w:uiPriority w:val="1"/>
-    <w:semiHidden/>
     <w:unhideWhenUsed/>
   </w:style>
   <w:style w:type="table" w:default="1" w:styleId="TableNormal">
@@ -1442,6 +1683,18 @@
       <w:smallCaps/>
       <w:color w:val="0F4761" w:themeColor="accent1" w:themeShade="BF"/>
       <w:spacing w:val="5"/>
+    </w:rPr>
+  </w:style>
+  <w:style w:type="paragraph" w:styleId="NormalWeb">
+    <w:name w:val="Normal (Web)"/>
+    <w:basedOn w:val="Normal"/>
+    <w:uiPriority w:val="99"/>
+    <w:semiHidden/>
+    <w:unhideWhenUsed/>
+    <w:rsid w:val="003E291C"/>
+    <w:rPr>
+      <w:rFonts w:ascii="Times New Roman" w:hAnsi="Times New Roman" w:cs="Times New Roman"/>
+      <w:sz w:val="24"/>
     </w:rPr>
   </w:style>
 </w:styles>

</xml_diff>